<commit_message>
Update exit questionaire to model "constructive feedback"
</commit_message>
<xml_diff>
--- a/CourseMaterials/08_wrap_up/00_off_boarding/exit_questionaire.docx
+++ b/CourseMaterials/08_wrap_up/00_off_boarding/exit_questionaire.docx
@@ -1,6 +1,6 @@
 
 <file path=word/document.xml><?xml version="1.0" encoding="utf-8"?>
-<w:document xmlns:wpc="http://schemas.microsoft.com/office/word/2010/wordprocessingCanvas" xmlns:cx="http://schemas.microsoft.com/office/drawing/2014/chartex" xmlns:cx1="http://schemas.microsoft.com/office/drawing/2015/9/8/chartex" xmlns:cx2="http://schemas.microsoft.com/office/drawing/2015/10/21/chartex" xmlns:cx3="http://schemas.microsoft.com/office/drawing/2016/5/9/chartex" xmlns:cx4="http://schemas.microsoft.com/office/drawing/2016/5/10/chartex" xmlns:cx5="http://schemas.microsoft.com/office/drawing/2016/5/11/chartex" xmlns:cx6="http://schemas.microsoft.com/office/drawing/2016/5/12/chartex" xmlns:cx7="http://schemas.microsoft.com/office/drawing/2016/5/13/chartex" xmlns:cx8="http://schemas.microsoft.com/office/drawing/2016/5/14/chartex" xmlns:mc="http://schemas.openxmlformats.org/markup-compatibility/2006" xmlns:aink="http://schemas.microsoft.com/office/drawing/2016/ink" xmlns:am3d="http://schemas.microsoft.com/office/drawing/2017/model3d" xmlns:o="urn:schemas-microsoft-com:office:office" xmlns:oel="http://schemas.microsoft.com/office/2019/extlst" xmlns:r="http://schemas.openxmlformats.org/officeDocument/2006/relationships" xmlns:m="http://schemas.openxmlformats.org/officeDocument/2006/math" xmlns:v="urn:schemas-microsoft-com:vml" xmlns:wp14="http://schemas.microsoft.com/office/word/2010/wordprocessingDrawing" xmlns:wp="http://schemas.openxmlformats.org/drawingml/2006/wordprocessingDrawing" xmlns:w10="urn:schemas-microsoft-com:office:word" xmlns:w="http://schemas.openxmlformats.org/wordprocessingml/2006/main" xmlns:w14="http://schemas.microsoft.com/office/word/2010/wordml" xmlns:w15="http://schemas.microsoft.com/office/word/2012/wordml" xmlns:w16cex="http://schemas.microsoft.com/office/word/2018/wordml/cex" xmlns:w16cid="http://schemas.microsoft.com/office/word/2016/wordml/cid" xmlns:w16="http://schemas.microsoft.com/office/word/2018/wordml" xmlns:w16sdtdh="http://schemas.microsoft.com/office/word/2020/wordml/sdtdatahash" xmlns:w16se="http://schemas.microsoft.com/office/word/2015/wordml/symex" xmlns:wpg="http://schemas.microsoft.com/office/word/2010/wordprocessingGroup" xmlns:wpi="http://schemas.microsoft.com/office/word/2010/wordprocessingInk" xmlns:wne="http://schemas.microsoft.com/office/word/2006/wordml" xmlns:wps="http://schemas.microsoft.com/office/word/2010/wordprocessingShape" mc:Ignorable="w14 w15 w16se w16cid w16 w16cex w16sdtdh wp14">
+<w:document xmlns:wpc="http://schemas.microsoft.com/office/word/2010/wordprocessingCanvas" xmlns:cx="http://schemas.microsoft.com/office/drawing/2014/chartex" xmlns:cx1="http://schemas.microsoft.com/office/drawing/2015/9/8/chartex" xmlns:cx2="http://schemas.microsoft.com/office/drawing/2015/10/21/chartex" xmlns:cx3="http://schemas.microsoft.com/office/drawing/2016/5/9/chartex" xmlns:cx4="http://schemas.microsoft.com/office/drawing/2016/5/10/chartex" xmlns:cx5="http://schemas.microsoft.com/office/drawing/2016/5/11/chartex" xmlns:cx6="http://schemas.microsoft.com/office/drawing/2016/5/12/chartex" xmlns:cx7="http://schemas.microsoft.com/office/drawing/2016/5/13/chartex" xmlns:cx8="http://schemas.microsoft.com/office/drawing/2016/5/14/chartex" xmlns:mc="http://schemas.openxmlformats.org/markup-compatibility/2006" xmlns:aink="http://schemas.microsoft.com/office/drawing/2016/ink" xmlns:am3d="http://schemas.microsoft.com/office/drawing/2017/model3d" xmlns:o="urn:schemas-microsoft-com:office:office" xmlns:oel="http://schemas.microsoft.com/office/2019/extlst" xmlns:r="http://schemas.openxmlformats.org/officeDocument/2006/relationships" xmlns:m="http://schemas.openxmlformats.org/officeDocument/2006/math" xmlns:v="urn:schemas-microsoft-com:vml" xmlns:wp14="http://schemas.microsoft.com/office/word/2010/wordprocessingDrawing" xmlns:wp="http://schemas.openxmlformats.org/drawingml/2006/wordprocessingDrawing" xmlns:w10="urn:schemas-microsoft-com:office:word" xmlns:w="http://schemas.openxmlformats.org/wordprocessingml/2006/main" xmlns:w14="http://schemas.microsoft.com/office/word/2010/wordml" xmlns:w15="http://schemas.microsoft.com/office/word/2012/wordml" xmlns:w16cex="http://schemas.microsoft.com/office/word/2018/wordml/cex" xmlns:w16cid="http://schemas.microsoft.com/office/word/2016/wordml/cid" xmlns:w16="http://schemas.microsoft.com/office/word/2018/wordml" xmlns:w16du="http://schemas.microsoft.com/office/word/2023/wordml/word16du" xmlns:w16sdtdh="http://schemas.microsoft.com/office/word/2020/wordml/sdtdatahash" xmlns:w16sdtfl="http://schemas.microsoft.com/office/word/2024/wordml/sdtformatlock" xmlns:w16se="http://schemas.microsoft.com/office/word/2015/wordml/symex" xmlns:wpg="http://schemas.microsoft.com/office/word/2010/wordprocessingGroup" xmlns:wpi="http://schemas.microsoft.com/office/word/2010/wordprocessingInk" xmlns:wne="http://schemas.microsoft.com/office/word/2006/wordml" xmlns:wps="http://schemas.microsoft.com/office/word/2010/wordprocessingShape" mc:Ignorable="w14 w15 w16se w16cid w16 w16cex w16sdtdh w16sdtfl w16du wp14">
   <w:body>
     <w:p>
       <w:pPr>
@@ -409,25 +409,7 @@
           <w:sz w:val="28"/>
           <w:szCs w:val="28"/>
         </w:rPr>
-        <w:t xml:space="preserve">If someone asks you in a few weeks, what did you learn in Computer Science with Mr. </w:t>
-      </w:r>
-      <w:proofErr w:type="spellStart"/>
-      <w:r>
-        <w:rPr>
-          <w:rFonts w:ascii="Garamond" w:hAnsi="Garamond"/>
-          <w:sz w:val="28"/>
-          <w:szCs w:val="28"/>
-        </w:rPr>
-        <w:t>Rizzi</w:t>
-      </w:r>
-      <w:proofErr w:type="spellEnd"/>
-      <w:r>
-        <w:rPr>
-          <w:rFonts w:ascii="Garamond" w:hAnsi="Garamond"/>
-          <w:sz w:val="28"/>
-          <w:szCs w:val="28"/>
-        </w:rPr>
-        <w:t>, what will you say</w:t>
+        <w:t>If someone asks you in a few weeks, what did you learn in Computer Science with Mr. Rizzi, what will you say</w:t>
       </w:r>
       <w:r>
         <w:rPr>
@@ -502,23 +484,63 @@
           <w:sz w:val="28"/>
           <w:szCs w:val="28"/>
         </w:rPr>
-        <w:t>What are you most excited to cover in ninth grade C</w:t>
-      </w:r>
-      <w:r>
-        <w:rPr>
-          <w:rFonts w:ascii="Garamond" w:hAnsi="Garamond"/>
-          <w:sz w:val="28"/>
-          <w:szCs w:val="28"/>
-        </w:rPr>
-        <w:t>omputer Science</w:t>
-      </w:r>
-      <w:r>
-        <w:rPr>
-          <w:rFonts w:ascii="Garamond" w:hAnsi="Garamond"/>
-          <w:sz w:val="28"/>
-          <w:szCs w:val="28"/>
-        </w:rPr>
-        <w:t>?</w:t>
+        <w:t>One of the</w:t>
+      </w:r>
+      <w:r>
+        <w:rPr>
+          <w:rFonts w:ascii="Garamond" w:hAnsi="Garamond"/>
+          <w:sz w:val="28"/>
+          <w:szCs w:val="28"/>
+        </w:rPr>
+        <w:t xml:space="preserve"> goal</w:t>
+      </w:r>
+      <w:r>
+        <w:rPr>
+          <w:rFonts w:ascii="Garamond" w:hAnsi="Garamond"/>
+          <w:sz w:val="28"/>
+          <w:szCs w:val="28"/>
+        </w:rPr>
+        <w:t xml:space="preserve">s </w:t>
+      </w:r>
+      <w:r>
+        <w:rPr>
+          <w:rFonts w:ascii="Garamond" w:hAnsi="Garamond"/>
+          <w:sz w:val="28"/>
+          <w:szCs w:val="28"/>
+        </w:rPr>
+        <w:t xml:space="preserve">of </w:t>
+      </w:r>
+      <w:r>
+        <w:rPr>
+          <w:rFonts w:ascii="Garamond" w:hAnsi="Garamond"/>
+          <w:sz w:val="28"/>
+          <w:szCs w:val="28"/>
+        </w:rPr>
+        <w:t>the</w:t>
+      </w:r>
+      <w:r>
+        <w:rPr>
+          <w:rFonts w:ascii="Garamond" w:hAnsi="Garamond"/>
+          <w:sz w:val="28"/>
+          <w:szCs w:val="28"/>
+        </w:rPr>
+        <w:t xml:space="preserve"> class was to make you feel more confident approaching a computer</w:t>
+      </w:r>
+      <w:r>
+        <w:rPr>
+          <w:rFonts w:ascii="Garamond" w:hAnsi="Garamond"/>
+          <w:sz w:val="28"/>
+          <w:szCs w:val="28"/>
+        </w:rPr>
+        <w:t xml:space="preserve">. </w:t>
+      </w:r>
+      <w:r>
+        <w:rPr>
+          <w:rFonts w:ascii="Garamond" w:hAnsi="Garamond"/>
+          <w:sz w:val="28"/>
+          <w:szCs w:val="28"/>
+        </w:rPr>
+        <w:t>Do you feel like the class accomplished this goal? Why or why not?</w:t>
       </w:r>
     </w:p>
     <w:p>
@@ -585,7 +607,316 @@
           <w:sz w:val="28"/>
           <w:szCs w:val="28"/>
         </w:rPr>
-        <w:t>On the back, draw your best idyllic mountain scene with mountains and trees (bonus points for including a mountain goat):</w:t>
+        <w:lastRenderedPageBreak/>
+        <w:t>Another goal of the class was</w:t>
+      </w:r>
+      <w:r>
+        <w:rPr>
+          <w:rFonts w:ascii="Garamond" w:hAnsi="Garamond"/>
+          <w:sz w:val="28"/>
+          <w:szCs w:val="28"/>
+        </w:rPr>
+        <w:t xml:space="preserve"> to show you all the layers hiding </w:t>
+      </w:r>
+      <w:r>
+        <w:rPr>
+          <w:rFonts w:ascii="Garamond" w:hAnsi="Garamond"/>
+          <w:sz w:val="28"/>
+          <w:szCs w:val="28"/>
+        </w:rPr>
+        <w:t>under</w:t>
+      </w:r>
+      <w:r>
+        <w:rPr>
+          <w:rFonts w:ascii="Garamond" w:hAnsi="Garamond"/>
+          <w:sz w:val="28"/>
+          <w:szCs w:val="28"/>
+        </w:rPr>
+        <w:t xml:space="preserve"> modern technology.</w:t>
+      </w:r>
+      <w:r>
+        <w:rPr>
+          <w:rFonts w:ascii="Garamond" w:hAnsi="Garamond"/>
+          <w:sz w:val="28"/>
+          <w:szCs w:val="28"/>
+        </w:rPr>
+        <w:t xml:space="preserve"> </w:t>
+      </w:r>
+      <w:r>
+        <w:rPr>
+          <w:rFonts w:ascii="Garamond" w:hAnsi="Garamond"/>
+          <w:sz w:val="28"/>
+          <w:szCs w:val="28"/>
+        </w:rPr>
+        <w:t>Do you feel like the class accomplished this goal? Why or why not?</w:t>
+      </w:r>
+    </w:p>
+    <w:p>
+      <w:pPr>
+        <w:rPr>
+          <w:rFonts w:ascii="Garamond" w:hAnsi="Garamond"/>
+          <w:sz w:val="28"/>
+          <w:szCs w:val="28"/>
+        </w:rPr>
+      </w:pPr>
+    </w:p>
+    <w:p>
+      <w:pPr>
+        <w:rPr>
+          <w:rFonts w:ascii="Garamond" w:hAnsi="Garamond"/>
+          <w:sz w:val="28"/>
+          <w:szCs w:val="28"/>
+        </w:rPr>
+      </w:pPr>
+    </w:p>
+    <w:p>
+      <w:pPr>
+        <w:rPr>
+          <w:rFonts w:ascii="Garamond" w:hAnsi="Garamond"/>
+          <w:sz w:val="28"/>
+          <w:szCs w:val="28"/>
+        </w:rPr>
+      </w:pPr>
+    </w:p>
+    <w:p>
+      <w:pPr>
+        <w:rPr>
+          <w:rFonts w:ascii="Garamond" w:hAnsi="Garamond"/>
+          <w:sz w:val="28"/>
+          <w:szCs w:val="28"/>
+        </w:rPr>
+      </w:pPr>
+    </w:p>
+    <w:p>
+      <w:pPr>
+        <w:rPr>
+          <w:rFonts w:ascii="Garamond" w:hAnsi="Garamond"/>
+          <w:sz w:val="28"/>
+          <w:szCs w:val="28"/>
+        </w:rPr>
+      </w:pPr>
+    </w:p>
+    <w:p>
+      <w:pPr>
+        <w:rPr>
+          <w:rFonts w:ascii="Garamond" w:hAnsi="Garamond"/>
+          <w:sz w:val="28"/>
+          <w:szCs w:val="28"/>
+        </w:rPr>
+      </w:pPr>
+    </w:p>
+    <w:p>
+      <w:pPr>
+        <w:pStyle w:val="ListParagraph"/>
+        <w:numPr>
+          <w:ilvl w:val="0"/>
+          <w:numId w:val="1"/>
+        </w:numPr>
+        <w:rPr>
+          <w:rFonts w:ascii="Garamond" w:hAnsi="Garamond"/>
+          <w:sz w:val="28"/>
+          <w:szCs w:val="28"/>
+        </w:rPr>
+      </w:pPr>
+      <w:r>
+        <w:rPr>
+          <w:rFonts w:ascii="Garamond" w:hAnsi="Garamond"/>
+          <w:sz w:val="28"/>
+          <w:szCs w:val="28"/>
+        </w:rPr>
+        <w:t>Provide one piece of constructive feedback about this class. A good piece of constructive feedback acknowledges the effort someone put into something</w:t>
+      </w:r>
+      <w:r>
+        <w:rPr>
+          <w:rFonts w:ascii="Garamond" w:hAnsi="Garamond"/>
+          <w:sz w:val="28"/>
+          <w:szCs w:val="28"/>
+        </w:rPr>
+        <w:t xml:space="preserve"> and</w:t>
+      </w:r>
+      <w:r>
+        <w:rPr>
+          <w:rFonts w:ascii="Garamond" w:hAnsi="Garamond"/>
+          <w:sz w:val="28"/>
+          <w:szCs w:val="28"/>
+        </w:rPr>
+        <w:t xml:space="preserve"> the</w:t>
+      </w:r>
+      <w:r>
+        <w:rPr>
+          <w:rFonts w:ascii="Garamond" w:hAnsi="Garamond"/>
+          <w:sz w:val="28"/>
+          <w:szCs w:val="28"/>
+        </w:rPr>
+        <w:t>n</w:t>
+      </w:r>
+      <w:r>
+        <w:rPr>
+          <w:rFonts w:ascii="Garamond" w:hAnsi="Garamond"/>
+          <w:sz w:val="28"/>
+          <w:szCs w:val="28"/>
+        </w:rPr>
+        <w:t xml:space="preserve"> provides a suggestion for how to improve.</w:t>
+      </w:r>
+    </w:p>
+    <w:p>
+      <w:pPr>
+        <w:rPr>
+          <w:rFonts w:ascii="Garamond" w:hAnsi="Garamond"/>
+          <w:sz w:val="28"/>
+          <w:szCs w:val="28"/>
+        </w:rPr>
+      </w:pPr>
+    </w:p>
+    <w:p>
+      <w:pPr>
+        <w:rPr>
+          <w:rFonts w:ascii="Garamond" w:hAnsi="Garamond"/>
+          <w:sz w:val="28"/>
+          <w:szCs w:val="28"/>
+        </w:rPr>
+      </w:pPr>
+    </w:p>
+    <w:p>
+      <w:pPr>
+        <w:rPr>
+          <w:rFonts w:ascii="Garamond" w:hAnsi="Garamond"/>
+          <w:sz w:val="28"/>
+          <w:szCs w:val="28"/>
+        </w:rPr>
+      </w:pPr>
+    </w:p>
+    <w:p>
+      <w:pPr>
+        <w:rPr>
+          <w:rFonts w:ascii="Garamond" w:hAnsi="Garamond"/>
+          <w:sz w:val="28"/>
+          <w:szCs w:val="28"/>
+        </w:rPr>
+      </w:pPr>
+    </w:p>
+    <w:p>
+      <w:pPr>
+        <w:rPr>
+          <w:rFonts w:ascii="Garamond" w:hAnsi="Garamond"/>
+          <w:sz w:val="28"/>
+          <w:szCs w:val="28"/>
+        </w:rPr>
+      </w:pPr>
+    </w:p>
+    <w:p>
+      <w:pPr>
+        <w:rPr>
+          <w:rFonts w:ascii="Garamond" w:hAnsi="Garamond"/>
+          <w:sz w:val="28"/>
+          <w:szCs w:val="28"/>
+        </w:rPr>
+      </w:pPr>
+    </w:p>
+    <w:p>
+      <w:pPr>
+        <w:pStyle w:val="ListParagraph"/>
+        <w:numPr>
+          <w:ilvl w:val="0"/>
+          <w:numId w:val="1"/>
+        </w:numPr>
+        <w:rPr>
+          <w:rFonts w:ascii="Garamond" w:hAnsi="Garamond"/>
+          <w:sz w:val="28"/>
+          <w:szCs w:val="28"/>
+        </w:rPr>
+      </w:pPr>
+      <w:r>
+        <w:rPr>
+          <w:rFonts w:ascii="Garamond" w:hAnsi="Garamond"/>
+          <w:sz w:val="28"/>
+          <w:szCs w:val="28"/>
+        </w:rPr>
+        <w:t>Is there anything else you think I should know about?</w:t>
+      </w:r>
+    </w:p>
+    <w:p>
+      <w:pPr>
+        <w:rPr>
+          <w:rFonts w:ascii="Garamond" w:hAnsi="Garamond"/>
+          <w:sz w:val="28"/>
+          <w:szCs w:val="28"/>
+        </w:rPr>
+      </w:pPr>
+    </w:p>
+    <w:p>
+      <w:pPr>
+        <w:rPr>
+          <w:rFonts w:ascii="Garamond" w:hAnsi="Garamond"/>
+          <w:sz w:val="28"/>
+          <w:szCs w:val="28"/>
+        </w:rPr>
+      </w:pPr>
+    </w:p>
+    <w:p>
+      <w:pPr>
+        <w:rPr>
+          <w:rFonts w:ascii="Garamond" w:hAnsi="Garamond"/>
+          <w:sz w:val="28"/>
+          <w:szCs w:val="28"/>
+        </w:rPr>
+      </w:pPr>
+    </w:p>
+    <w:p>
+      <w:pPr>
+        <w:rPr>
+          <w:rFonts w:ascii="Garamond" w:hAnsi="Garamond"/>
+          <w:sz w:val="28"/>
+          <w:szCs w:val="28"/>
+        </w:rPr>
+      </w:pPr>
+    </w:p>
+    <w:p>
+      <w:pPr>
+        <w:rPr>
+          <w:rFonts w:ascii="Garamond" w:hAnsi="Garamond"/>
+          <w:sz w:val="28"/>
+          <w:szCs w:val="28"/>
+        </w:rPr>
+      </w:pPr>
+    </w:p>
+    <w:p>
+      <w:pPr>
+        <w:rPr>
+          <w:rFonts w:ascii="Garamond" w:hAnsi="Garamond"/>
+          <w:sz w:val="28"/>
+          <w:szCs w:val="28"/>
+        </w:rPr>
+      </w:pPr>
+    </w:p>
+    <w:p>
+      <w:pPr>
+        <w:pStyle w:val="ListParagraph"/>
+        <w:numPr>
+          <w:ilvl w:val="0"/>
+          <w:numId w:val="1"/>
+        </w:numPr>
+        <w:rPr>
+          <w:rFonts w:ascii="Garamond" w:hAnsi="Garamond"/>
+          <w:sz w:val="28"/>
+          <w:szCs w:val="28"/>
+        </w:rPr>
+      </w:pPr>
+      <w:r>
+        <w:rPr>
+          <w:rFonts w:ascii="Garamond" w:hAnsi="Garamond"/>
+          <w:sz w:val="28"/>
+          <w:szCs w:val="28"/>
+        </w:rPr>
+        <w:t>In the space below, d</w:t>
+      </w:r>
+      <w:r>
+        <w:rPr>
+          <w:rFonts w:ascii="Garamond" w:hAnsi="Garamond"/>
+          <w:sz w:val="28"/>
+          <w:szCs w:val="28"/>
+        </w:rPr>
+        <w:t>raw your best idyllic mountain scene with mountains and trees (bonus points for including a mountain goat):</w:t>
       </w:r>
     </w:p>
     <w:sectPr>
@@ -599,7 +930,7 @@
 </file>
 
 <file path=word/numbering.xml><?xml version="1.0" encoding="utf-8"?>
-<w:numbering xmlns:wpc="http://schemas.microsoft.com/office/word/2010/wordprocessingCanvas" xmlns:cx="http://schemas.microsoft.com/office/drawing/2014/chartex" xmlns:cx1="http://schemas.microsoft.com/office/drawing/2015/9/8/chartex" xmlns:cx2="http://schemas.microsoft.com/office/drawing/2015/10/21/chartex" xmlns:cx3="http://schemas.microsoft.com/office/drawing/2016/5/9/chartex" xmlns:cx4="http://schemas.microsoft.com/office/drawing/2016/5/10/chartex" xmlns:cx5="http://schemas.microsoft.com/office/drawing/2016/5/11/chartex" xmlns:cx6="http://schemas.microsoft.com/office/drawing/2016/5/12/chartex" xmlns:cx7="http://schemas.microsoft.com/office/drawing/2016/5/13/chartex" xmlns:cx8="http://schemas.microsoft.com/office/drawing/2016/5/14/chartex" xmlns:mc="http://schemas.openxmlformats.org/markup-compatibility/2006" xmlns:aink="http://schemas.microsoft.com/office/drawing/2016/ink" xmlns:am3d="http://schemas.microsoft.com/office/drawing/2017/model3d" xmlns:o="urn:schemas-microsoft-com:office:office" xmlns:oel="http://schemas.microsoft.com/office/2019/extlst" xmlns:r="http://schemas.openxmlformats.org/officeDocument/2006/relationships" xmlns:m="http://schemas.openxmlformats.org/officeDocument/2006/math" xmlns:v="urn:schemas-microsoft-com:vml" xmlns:wp14="http://schemas.microsoft.com/office/word/2010/wordprocessingDrawing" xmlns:wp="http://schemas.openxmlformats.org/drawingml/2006/wordprocessingDrawing" xmlns:w10="urn:schemas-microsoft-com:office:word" xmlns:w="http://schemas.openxmlformats.org/wordprocessingml/2006/main" xmlns:w14="http://schemas.microsoft.com/office/word/2010/wordml" xmlns:w15="http://schemas.microsoft.com/office/word/2012/wordml" xmlns:w16cex="http://schemas.microsoft.com/office/word/2018/wordml/cex" xmlns:w16cid="http://schemas.microsoft.com/office/word/2016/wordml/cid" xmlns:w16="http://schemas.microsoft.com/office/word/2018/wordml" xmlns:w16sdtdh="http://schemas.microsoft.com/office/word/2020/wordml/sdtdatahash" xmlns:w16se="http://schemas.microsoft.com/office/word/2015/wordml/symex" xmlns:wpg="http://schemas.microsoft.com/office/word/2010/wordprocessingGroup" xmlns:wpi="http://schemas.microsoft.com/office/word/2010/wordprocessingInk" xmlns:wne="http://schemas.microsoft.com/office/word/2006/wordml" xmlns:wps="http://schemas.microsoft.com/office/word/2010/wordprocessingShape" mc:Ignorable="w14 w15 w16se w16cid w16 w16cex w16sdtdh wp14">
+<w:numbering xmlns:wpc="http://schemas.microsoft.com/office/word/2010/wordprocessingCanvas" xmlns:cx="http://schemas.microsoft.com/office/drawing/2014/chartex" xmlns:cx1="http://schemas.microsoft.com/office/drawing/2015/9/8/chartex" xmlns:cx2="http://schemas.microsoft.com/office/drawing/2015/10/21/chartex" xmlns:cx3="http://schemas.microsoft.com/office/drawing/2016/5/9/chartex" xmlns:cx4="http://schemas.microsoft.com/office/drawing/2016/5/10/chartex" xmlns:cx5="http://schemas.microsoft.com/office/drawing/2016/5/11/chartex" xmlns:cx6="http://schemas.microsoft.com/office/drawing/2016/5/12/chartex" xmlns:cx7="http://schemas.microsoft.com/office/drawing/2016/5/13/chartex" xmlns:cx8="http://schemas.microsoft.com/office/drawing/2016/5/14/chartex" xmlns:mc="http://schemas.openxmlformats.org/markup-compatibility/2006" xmlns:aink="http://schemas.microsoft.com/office/drawing/2016/ink" xmlns:am3d="http://schemas.microsoft.com/office/drawing/2017/model3d" xmlns:o="urn:schemas-microsoft-com:office:office" xmlns:oel="http://schemas.microsoft.com/office/2019/extlst" xmlns:r="http://schemas.openxmlformats.org/officeDocument/2006/relationships" xmlns:m="http://schemas.openxmlformats.org/officeDocument/2006/math" xmlns:v="urn:schemas-microsoft-com:vml" xmlns:wp14="http://schemas.microsoft.com/office/word/2010/wordprocessingDrawing" xmlns:wp="http://schemas.openxmlformats.org/drawingml/2006/wordprocessingDrawing" xmlns:w10="urn:schemas-microsoft-com:office:word" xmlns:w="http://schemas.openxmlformats.org/wordprocessingml/2006/main" xmlns:w14="http://schemas.microsoft.com/office/word/2010/wordml" xmlns:w15="http://schemas.microsoft.com/office/word/2012/wordml" xmlns:w16cex="http://schemas.microsoft.com/office/word/2018/wordml/cex" xmlns:w16cid="http://schemas.microsoft.com/office/word/2016/wordml/cid" xmlns:w16="http://schemas.microsoft.com/office/word/2018/wordml" xmlns:w16du="http://schemas.microsoft.com/office/word/2023/wordml/word16du" xmlns:w16sdtdh="http://schemas.microsoft.com/office/word/2020/wordml/sdtdatahash" xmlns:w16sdtfl="http://schemas.microsoft.com/office/word/2024/wordml/sdtformatlock" xmlns:w16se="http://schemas.microsoft.com/office/word/2015/wordml/symex" xmlns:wpg="http://schemas.microsoft.com/office/word/2010/wordprocessingGroup" xmlns:wpi="http://schemas.microsoft.com/office/word/2010/wordprocessingInk" xmlns:wne="http://schemas.microsoft.com/office/word/2006/wordml" xmlns:wps="http://schemas.microsoft.com/office/word/2010/wordprocessingShape" mc:Ignorable="w14 w15 w16se w16cid w16 w16cex w16sdtdh w16sdtfl w16du wp14">
   <w:abstractNum w:abstractNumId="0" w15:restartNumberingAfterBreak="0">
     <w:nsid w:val="66AF1173"/>
     <w:multiLevelType w:val="hybridMultilevel"/>
@@ -696,7 +1027,7 @@
 </file>
 
 <file path=word/styles.xml><?xml version="1.0" encoding="utf-8"?>
-<w:styles xmlns:mc="http://schemas.openxmlformats.org/markup-compatibility/2006" xmlns:r="http://schemas.openxmlformats.org/officeDocument/2006/relationships" xmlns:w="http://schemas.openxmlformats.org/wordprocessingml/2006/main" xmlns:w14="http://schemas.microsoft.com/office/word/2010/wordml" xmlns:w15="http://schemas.microsoft.com/office/word/2012/wordml" xmlns:w16cex="http://schemas.microsoft.com/office/word/2018/wordml/cex" xmlns:w16cid="http://schemas.microsoft.com/office/word/2016/wordml/cid" xmlns:w16="http://schemas.microsoft.com/office/word/2018/wordml" xmlns:w16sdtdh="http://schemas.microsoft.com/office/word/2020/wordml/sdtdatahash" xmlns:w16se="http://schemas.microsoft.com/office/word/2015/wordml/symex" mc:Ignorable="w14 w15 w16se w16cid w16 w16cex w16sdtdh">
+<w:styles xmlns:mc="http://schemas.openxmlformats.org/markup-compatibility/2006" xmlns:r="http://schemas.openxmlformats.org/officeDocument/2006/relationships" xmlns:w="http://schemas.openxmlformats.org/wordprocessingml/2006/main" xmlns:w14="http://schemas.microsoft.com/office/word/2010/wordml" xmlns:w15="http://schemas.microsoft.com/office/word/2012/wordml" xmlns:w16cex="http://schemas.microsoft.com/office/word/2018/wordml/cex" xmlns:w16cid="http://schemas.microsoft.com/office/word/2016/wordml/cid" xmlns:w16="http://schemas.microsoft.com/office/word/2018/wordml" xmlns:w16du="http://schemas.microsoft.com/office/word/2023/wordml/word16du" xmlns:w16sdtdh="http://schemas.microsoft.com/office/word/2020/wordml/sdtdatahash" xmlns:w16sdtfl="http://schemas.microsoft.com/office/word/2024/wordml/sdtformatlock" xmlns:w16se="http://schemas.microsoft.com/office/word/2015/wordml/symex" mc:Ignorable="w14 w15 w16se w16cid w16 w16cex w16sdtdh w16sdtfl w16du">
   <w:docDefaults>
     <w:rPrDefault>
       <w:rPr>

</xml_diff>

<commit_message>
Finalized "off-boarding" lesson and exit questionnaire
</commit_message>
<xml_diff>
--- a/CourseMaterials/08_wrap_up/00_off_boarding/exit_questionaire.docx
+++ b/CourseMaterials/08_wrap_up/00_off_boarding/exit_questionaire.docx
@@ -83,31 +83,17 @@
         </w:numPr>
         <w:rPr>
           <w:rFonts w:ascii="Garamond" w:hAnsi="Garamond"/>
-          <w:sz w:val="28"/>
-          <w:szCs w:val="28"/>
-        </w:rPr>
-      </w:pPr>
-      <w:r>
-        <w:rPr>
-          <w:rFonts w:ascii="Garamond" w:hAnsi="Garamond"/>
-          <w:sz w:val="28"/>
-          <w:szCs w:val="28"/>
-        </w:rPr>
-        <w:t>What was your favorite</w:t>
-      </w:r>
-      <w:r>
-        <w:rPr>
-          <w:rFonts w:ascii="Garamond" w:hAnsi="Garamond"/>
-          <w:sz w:val="28"/>
-          <w:szCs w:val="28"/>
-        </w:rPr>
-        <w:t xml:space="preserve"> lesson or project</w:t>
-      </w:r>
-      <w:r>
-        <w:rPr>
-          <w:rFonts w:ascii="Garamond" w:hAnsi="Garamond"/>
-          <w:sz w:val="28"/>
-          <w:szCs w:val="28"/>
+        </w:rPr>
+      </w:pPr>
+      <w:r>
+        <w:rPr>
+          <w:rFonts w:ascii="Garamond" w:hAnsi="Garamond"/>
+        </w:rPr>
+        <w:t>What was your favorite lesson or project</w:t>
+      </w:r>
+      <w:r>
+        <w:rPr>
+          <w:rFonts w:ascii="Garamond" w:hAnsi="Garamond"/>
         </w:rPr>
         <w:t>?</w:t>
       </w:r>
@@ -116,44 +102,41 @@
       <w:pPr>
         <w:rPr>
           <w:rFonts w:ascii="Garamond" w:hAnsi="Garamond"/>
-          <w:sz w:val="28"/>
-          <w:szCs w:val="28"/>
-        </w:rPr>
-      </w:pPr>
-    </w:p>
-    <w:p>
-      <w:pPr>
-        <w:rPr>
-          <w:rFonts w:ascii="Garamond" w:hAnsi="Garamond"/>
-          <w:sz w:val="28"/>
-          <w:szCs w:val="28"/>
-        </w:rPr>
-      </w:pPr>
-    </w:p>
-    <w:p>
-      <w:pPr>
-        <w:rPr>
-          <w:rFonts w:ascii="Garamond" w:hAnsi="Garamond"/>
-          <w:sz w:val="28"/>
-          <w:szCs w:val="28"/>
-        </w:rPr>
-      </w:pPr>
-    </w:p>
-    <w:p>
-      <w:pPr>
-        <w:rPr>
-          <w:rFonts w:ascii="Garamond" w:hAnsi="Garamond"/>
-          <w:sz w:val="28"/>
-          <w:szCs w:val="28"/>
-        </w:rPr>
-      </w:pPr>
-    </w:p>
-    <w:p>
-      <w:pPr>
-        <w:rPr>
-          <w:rFonts w:ascii="Garamond" w:hAnsi="Garamond"/>
-          <w:sz w:val="28"/>
-          <w:szCs w:val="28"/>
+        </w:rPr>
+      </w:pPr>
+    </w:p>
+    <w:p>
+      <w:pPr>
+        <w:rPr>
+          <w:rFonts w:ascii="Garamond" w:hAnsi="Garamond"/>
+        </w:rPr>
+      </w:pPr>
+    </w:p>
+    <w:p>
+      <w:pPr>
+        <w:rPr>
+          <w:rFonts w:ascii="Garamond" w:hAnsi="Garamond"/>
+        </w:rPr>
+      </w:pPr>
+    </w:p>
+    <w:p>
+      <w:pPr>
+        <w:rPr>
+          <w:rFonts w:ascii="Garamond" w:hAnsi="Garamond"/>
+        </w:rPr>
+      </w:pPr>
+    </w:p>
+    <w:p>
+      <w:pPr>
+        <w:rPr>
+          <w:rFonts w:ascii="Garamond" w:hAnsi="Garamond"/>
+        </w:rPr>
+      </w:pPr>
+    </w:p>
+    <w:p>
+      <w:pPr>
+        <w:rPr>
+          <w:rFonts w:ascii="Garamond" w:hAnsi="Garamond"/>
         </w:rPr>
       </w:pPr>
     </w:p>
@@ -166,31 +149,17 @@
         </w:numPr>
         <w:rPr>
           <w:rFonts w:ascii="Garamond" w:hAnsi="Garamond"/>
-          <w:sz w:val="28"/>
-          <w:szCs w:val="28"/>
-        </w:rPr>
-      </w:pPr>
-      <w:r>
-        <w:rPr>
-          <w:rFonts w:ascii="Garamond" w:hAnsi="Garamond"/>
-          <w:sz w:val="28"/>
-          <w:szCs w:val="28"/>
-        </w:rPr>
-        <w:t>What was your least favorite</w:t>
-      </w:r>
-      <w:r>
-        <w:rPr>
-          <w:rFonts w:ascii="Garamond" w:hAnsi="Garamond"/>
-          <w:sz w:val="28"/>
-          <w:szCs w:val="28"/>
-        </w:rPr>
-        <w:t xml:space="preserve"> lesson or project</w:t>
-      </w:r>
-      <w:r>
-        <w:rPr>
-          <w:rFonts w:ascii="Garamond" w:hAnsi="Garamond"/>
-          <w:sz w:val="28"/>
-          <w:szCs w:val="28"/>
+        </w:rPr>
+      </w:pPr>
+      <w:r>
+        <w:rPr>
+          <w:rFonts w:ascii="Garamond" w:hAnsi="Garamond"/>
+        </w:rPr>
+        <w:t>What was your least favorite lesson or project</w:t>
+      </w:r>
+      <w:r>
+        <w:rPr>
+          <w:rFonts w:ascii="Garamond" w:hAnsi="Garamond"/>
         </w:rPr>
         <w:t>?</w:t>
       </w:r>
@@ -199,44 +168,41 @@
       <w:pPr>
         <w:rPr>
           <w:rFonts w:ascii="Garamond" w:hAnsi="Garamond"/>
-          <w:sz w:val="28"/>
-          <w:szCs w:val="28"/>
-        </w:rPr>
-      </w:pPr>
-    </w:p>
-    <w:p>
-      <w:pPr>
-        <w:rPr>
-          <w:rFonts w:ascii="Garamond" w:hAnsi="Garamond"/>
-          <w:sz w:val="28"/>
-          <w:szCs w:val="28"/>
-        </w:rPr>
-      </w:pPr>
-    </w:p>
-    <w:p>
-      <w:pPr>
-        <w:rPr>
-          <w:rFonts w:ascii="Garamond" w:hAnsi="Garamond"/>
-          <w:sz w:val="28"/>
-          <w:szCs w:val="28"/>
-        </w:rPr>
-      </w:pPr>
-    </w:p>
-    <w:p>
-      <w:pPr>
-        <w:rPr>
-          <w:rFonts w:ascii="Garamond" w:hAnsi="Garamond"/>
-          <w:sz w:val="28"/>
-          <w:szCs w:val="28"/>
-        </w:rPr>
-      </w:pPr>
-    </w:p>
-    <w:p>
-      <w:pPr>
-        <w:rPr>
-          <w:rFonts w:ascii="Garamond" w:hAnsi="Garamond"/>
-          <w:sz w:val="28"/>
-          <w:szCs w:val="28"/>
+        </w:rPr>
+      </w:pPr>
+    </w:p>
+    <w:p>
+      <w:pPr>
+        <w:rPr>
+          <w:rFonts w:ascii="Garamond" w:hAnsi="Garamond"/>
+        </w:rPr>
+      </w:pPr>
+    </w:p>
+    <w:p>
+      <w:pPr>
+        <w:rPr>
+          <w:rFonts w:ascii="Garamond" w:hAnsi="Garamond"/>
+        </w:rPr>
+      </w:pPr>
+    </w:p>
+    <w:p>
+      <w:pPr>
+        <w:rPr>
+          <w:rFonts w:ascii="Garamond" w:hAnsi="Garamond"/>
+        </w:rPr>
+      </w:pPr>
+    </w:p>
+    <w:p>
+      <w:pPr>
+        <w:rPr>
+          <w:rFonts w:ascii="Garamond" w:hAnsi="Garamond"/>
+        </w:rPr>
+      </w:pPr>
+    </w:p>
+    <w:p>
+      <w:pPr>
+        <w:rPr>
+          <w:rFonts w:ascii="Garamond" w:hAnsi="Garamond"/>
         </w:rPr>
       </w:pPr>
     </w:p>
@@ -249,23 +215,17 @@
         </w:numPr>
         <w:rPr>
           <w:rFonts w:ascii="Garamond" w:hAnsi="Garamond"/>
-          <w:sz w:val="28"/>
-          <w:szCs w:val="28"/>
-        </w:rPr>
-      </w:pPr>
-      <w:r>
-        <w:rPr>
-          <w:rFonts w:ascii="Garamond" w:hAnsi="Garamond"/>
-          <w:sz w:val="28"/>
-          <w:szCs w:val="28"/>
+        </w:rPr>
+      </w:pPr>
+      <w:r>
+        <w:rPr>
+          <w:rFonts w:ascii="Garamond" w:hAnsi="Garamond"/>
         </w:rPr>
         <w:t>What is something you understand better having taken this class</w:t>
       </w:r>
       <w:r>
         <w:rPr>
           <w:rFonts w:ascii="Garamond" w:hAnsi="Garamond"/>
-          <w:sz w:val="28"/>
-          <w:szCs w:val="28"/>
         </w:rPr>
         <w:t>?</w:t>
       </w:r>
@@ -274,44 +234,41 @@
       <w:pPr>
         <w:rPr>
           <w:rFonts w:ascii="Garamond" w:hAnsi="Garamond"/>
-          <w:sz w:val="28"/>
-          <w:szCs w:val="28"/>
-        </w:rPr>
-      </w:pPr>
-    </w:p>
-    <w:p>
-      <w:pPr>
-        <w:rPr>
-          <w:rFonts w:ascii="Garamond" w:hAnsi="Garamond"/>
-          <w:sz w:val="28"/>
-          <w:szCs w:val="28"/>
-        </w:rPr>
-      </w:pPr>
-    </w:p>
-    <w:p>
-      <w:pPr>
-        <w:rPr>
-          <w:rFonts w:ascii="Garamond" w:hAnsi="Garamond"/>
-          <w:sz w:val="28"/>
-          <w:szCs w:val="28"/>
-        </w:rPr>
-      </w:pPr>
-    </w:p>
-    <w:p>
-      <w:pPr>
-        <w:rPr>
-          <w:rFonts w:ascii="Garamond" w:hAnsi="Garamond"/>
-          <w:sz w:val="28"/>
-          <w:szCs w:val="28"/>
-        </w:rPr>
-      </w:pPr>
-    </w:p>
-    <w:p>
-      <w:pPr>
-        <w:rPr>
-          <w:rFonts w:ascii="Garamond" w:hAnsi="Garamond"/>
-          <w:sz w:val="28"/>
-          <w:szCs w:val="28"/>
+        </w:rPr>
+      </w:pPr>
+    </w:p>
+    <w:p>
+      <w:pPr>
+        <w:rPr>
+          <w:rFonts w:ascii="Garamond" w:hAnsi="Garamond"/>
+        </w:rPr>
+      </w:pPr>
+    </w:p>
+    <w:p>
+      <w:pPr>
+        <w:rPr>
+          <w:rFonts w:ascii="Garamond" w:hAnsi="Garamond"/>
+        </w:rPr>
+      </w:pPr>
+    </w:p>
+    <w:p>
+      <w:pPr>
+        <w:rPr>
+          <w:rFonts w:ascii="Garamond" w:hAnsi="Garamond"/>
+        </w:rPr>
+      </w:pPr>
+    </w:p>
+    <w:p>
+      <w:pPr>
+        <w:rPr>
+          <w:rFonts w:ascii="Garamond" w:hAnsi="Garamond"/>
+        </w:rPr>
+      </w:pPr>
+    </w:p>
+    <w:p>
+      <w:pPr>
+        <w:rPr>
+          <w:rFonts w:ascii="Garamond" w:hAnsi="Garamond"/>
         </w:rPr>
       </w:pPr>
     </w:p>
@@ -324,69 +281,54 @@
         </w:numPr>
         <w:rPr>
           <w:rFonts w:ascii="Garamond" w:hAnsi="Garamond"/>
-          <w:sz w:val="28"/>
-          <w:szCs w:val="28"/>
-        </w:rPr>
-      </w:pPr>
-      <w:r>
-        <w:rPr>
-          <w:rFonts w:ascii="Garamond" w:hAnsi="Garamond"/>
-          <w:sz w:val="28"/>
-          <w:szCs w:val="28"/>
-        </w:rPr>
-        <w:t xml:space="preserve">What were you disappointed we didn't do </w:t>
-      </w:r>
-      <w:r>
-        <w:rPr>
-          <w:rFonts w:ascii="Garamond" w:hAnsi="Garamond"/>
-          <w:sz w:val="28"/>
-          <w:szCs w:val="28"/>
-        </w:rPr>
-        <w:t>more of?</w:t>
-      </w:r>
-    </w:p>
-    <w:p>
-      <w:pPr>
-        <w:rPr>
-          <w:rFonts w:ascii="Garamond" w:hAnsi="Garamond"/>
-          <w:sz w:val="28"/>
-          <w:szCs w:val="28"/>
-        </w:rPr>
-      </w:pPr>
-    </w:p>
-    <w:p>
-      <w:pPr>
-        <w:rPr>
-          <w:rFonts w:ascii="Garamond" w:hAnsi="Garamond"/>
-          <w:sz w:val="28"/>
-          <w:szCs w:val="28"/>
-        </w:rPr>
-      </w:pPr>
-    </w:p>
-    <w:p>
-      <w:pPr>
-        <w:rPr>
-          <w:rFonts w:ascii="Garamond" w:hAnsi="Garamond"/>
-          <w:sz w:val="28"/>
-          <w:szCs w:val="28"/>
-        </w:rPr>
-      </w:pPr>
-    </w:p>
-    <w:p>
-      <w:pPr>
-        <w:rPr>
-          <w:rFonts w:ascii="Garamond" w:hAnsi="Garamond"/>
-          <w:sz w:val="28"/>
-          <w:szCs w:val="28"/>
-        </w:rPr>
-      </w:pPr>
-    </w:p>
-    <w:p>
-      <w:pPr>
-        <w:rPr>
-          <w:rFonts w:ascii="Garamond" w:hAnsi="Garamond"/>
-          <w:sz w:val="28"/>
-          <w:szCs w:val="28"/>
+        </w:rPr>
+      </w:pPr>
+      <w:r>
+        <w:rPr>
+          <w:rFonts w:ascii="Garamond" w:hAnsi="Garamond"/>
+        </w:rPr>
+        <w:t>What were you disappointed we didn't do more of?</w:t>
+      </w:r>
+    </w:p>
+    <w:p>
+      <w:pPr>
+        <w:rPr>
+          <w:rFonts w:ascii="Garamond" w:hAnsi="Garamond"/>
+        </w:rPr>
+      </w:pPr>
+    </w:p>
+    <w:p>
+      <w:pPr>
+        <w:rPr>
+          <w:rFonts w:ascii="Garamond" w:hAnsi="Garamond"/>
+        </w:rPr>
+      </w:pPr>
+    </w:p>
+    <w:p>
+      <w:pPr>
+        <w:rPr>
+          <w:rFonts w:ascii="Garamond" w:hAnsi="Garamond"/>
+        </w:rPr>
+      </w:pPr>
+    </w:p>
+    <w:p>
+      <w:pPr>
+        <w:rPr>
+          <w:rFonts w:ascii="Garamond" w:hAnsi="Garamond"/>
+        </w:rPr>
+      </w:pPr>
+    </w:p>
+    <w:p>
+      <w:pPr>
+        <w:rPr>
+          <w:rFonts w:ascii="Garamond" w:hAnsi="Garamond"/>
+        </w:rPr>
+      </w:pPr>
+    </w:p>
+    <w:p>
+      <w:pPr>
+        <w:rPr>
+          <w:rFonts w:ascii="Garamond" w:hAnsi="Garamond"/>
         </w:rPr>
       </w:pPr>
     </w:p>
@@ -399,23 +341,41 @@
         </w:numPr>
         <w:rPr>
           <w:rFonts w:ascii="Garamond" w:hAnsi="Garamond"/>
-          <w:sz w:val="28"/>
-          <w:szCs w:val="28"/>
-        </w:rPr>
-      </w:pPr>
-      <w:r>
-        <w:rPr>
-          <w:rFonts w:ascii="Garamond" w:hAnsi="Garamond"/>
-          <w:sz w:val="28"/>
-          <w:szCs w:val="28"/>
-        </w:rPr>
-        <w:t>If someone asks you in a few weeks, what did you learn in Computer Science with Mr. Rizzi, what will you say</w:t>
-      </w:r>
-      <w:r>
-        <w:rPr>
-          <w:rFonts w:ascii="Garamond" w:hAnsi="Garamond"/>
-          <w:sz w:val="28"/>
-          <w:szCs w:val="28"/>
+        </w:rPr>
+      </w:pPr>
+      <w:r>
+        <w:rPr>
+          <w:rFonts w:ascii="Garamond" w:hAnsi="Garamond"/>
+        </w:rPr>
+        <w:t xml:space="preserve">If someone asks you in a few weeks, </w:t>
+      </w:r>
+      <w:r>
+        <w:rPr>
+          <w:rFonts w:ascii="Garamond" w:hAnsi="Garamond"/>
+        </w:rPr>
+        <w:t>“</w:t>
+      </w:r>
+      <w:r>
+        <w:rPr>
+          <w:rFonts w:ascii="Garamond" w:hAnsi="Garamond"/>
+        </w:rPr>
+        <w:t>what did you learn in Computer Science</w:t>
+      </w:r>
+      <w:r>
+        <w:rPr>
+          <w:rFonts w:ascii="Garamond" w:hAnsi="Garamond"/>
+        </w:rPr>
+        <w:t>”</w:t>
+      </w:r>
+      <w:r>
+        <w:rPr>
+          <w:rFonts w:ascii="Garamond" w:hAnsi="Garamond"/>
+        </w:rPr>
+        <w:t>, what will you say</w:t>
+      </w:r>
+      <w:r>
+        <w:rPr>
+          <w:rFonts w:ascii="Garamond" w:hAnsi="Garamond"/>
         </w:rPr>
         <w:t>?</w:t>
       </w:r>
@@ -424,44 +384,41 @@
       <w:pPr>
         <w:rPr>
           <w:rFonts w:ascii="Garamond" w:hAnsi="Garamond"/>
-          <w:sz w:val="28"/>
-          <w:szCs w:val="28"/>
-        </w:rPr>
-      </w:pPr>
-    </w:p>
-    <w:p>
-      <w:pPr>
-        <w:rPr>
-          <w:rFonts w:ascii="Garamond" w:hAnsi="Garamond"/>
-          <w:sz w:val="28"/>
-          <w:szCs w:val="28"/>
-        </w:rPr>
-      </w:pPr>
-    </w:p>
-    <w:p>
-      <w:pPr>
-        <w:rPr>
-          <w:rFonts w:ascii="Garamond" w:hAnsi="Garamond"/>
-          <w:sz w:val="28"/>
-          <w:szCs w:val="28"/>
-        </w:rPr>
-      </w:pPr>
-    </w:p>
-    <w:p>
-      <w:pPr>
-        <w:rPr>
-          <w:rFonts w:ascii="Garamond" w:hAnsi="Garamond"/>
-          <w:sz w:val="28"/>
-          <w:szCs w:val="28"/>
-        </w:rPr>
-      </w:pPr>
-    </w:p>
-    <w:p>
-      <w:pPr>
-        <w:rPr>
-          <w:rFonts w:ascii="Garamond" w:hAnsi="Garamond"/>
-          <w:sz w:val="28"/>
-          <w:szCs w:val="28"/>
+        </w:rPr>
+      </w:pPr>
+    </w:p>
+    <w:p>
+      <w:pPr>
+        <w:rPr>
+          <w:rFonts w:ascii="Garamond" w:hAnsi="Garamond"/>
+        </w:rPr>
+      </w:pPr>
+    </w:p>
+    <w:p>
+      <w:pPr>
+        <w:rPr>
+          <w:rFonts w:ascii="Garamond" w:hAnsi="Garamond"/>
+        </w:rPr>
+      </w:pPr>
+    </w:p>
+    <w:p>
+      <w:pPr>
+        <w:rPr>
+          <w:rFonts w:ascii="Garamond" w:hAnsi="Garamond"/>
+        </w:rPr>
+      </w:pPr>
+    </w:p>
+    <w:p>
+      <w:pPr>
+        <w:rPr>
+          <w:rFonts w:ascii="Garamond" w:hAnsi="Garamond"/>
+        </w:rPr>
+      </w:pPr>
+    </w:p>
+    <w:p>
+      <w:pPr>
+        <w:rPr>
+          <w:rFonts w:ascii="Garamond" w:hAnsi="Garamond"/>
         </w:rPr>
       </w:pPr>
     </w:p>
@@ -474,71 +431,53 @@
         </w:numPr>
         <w:rPr>
           <w:rFonts w:ascii="Garamond" w:hAnsi="Garamond"/>
-          <w:sz w:val="28"/>
-          <w:szCs w:val="28"/>
-        </w:rPr>
-      </w:pPr>
-      <w:r>
-        <w:rPr>
-          <w:rFonts w:ascii="Garamond" w:hAnsi="Garamond"/>
-          <w:sz w:val="28"/>
-          <w:szCs w:val="28"/>
+        </w:rPr>
+      </w:pPr>
+      <w:r>
+        <w:rPr>
+          <w:rFonts w:ascii="Garamond" w:hAnsi="Garamond"/>
         </w:rPr>
         <w:t>One of the</w:t>
       </w:r>
       <w:r>
         <w:rPr>
           <w:rFonts w:ascii="Garamond" w:hAnsi="Garamond"/>
-          <w:sz w:val="28"/>
-          <w:szCs w:val="28"/>
         </w:rPr>
         <w:t xml:space="preserve"> goal</w:t>
       </w:r>
       <w:r>
         <w:rPr>
           <w:rFonts w:ascii="Garamond" w:hAnsi="Garamond"/>
-          <w:sz w:val="28"/>
-          <w:szCs w:val="28"/>
         </w:rPr>
         <w:t xml:space="preserve">s </w:t>
       </w:r>
       <w:r>
         <w:rPr>
           <w:rFonts w:ascii="Garamond" w:hAnsi="Garamond"/>
-          <w:sz w:val="28"/>
-          <w:szCs w:val="28"/>
         </w:rPr>
         <w:t xml:space="preserve">of </w:t>
       </w:r>
       <w:r>
         <w:rPr>
           <w:rFonts w:ascii="Garamond" w:hAnsi="Garamond"/>
-          <w:sz w:val="28"/>
-          <w:szCs w:val="28"/>
         </w:rPr>
         <w:t>the</w:t>
       </w:r>
       <w:r>
         <w:rPr>
           <w:rFonts w:ascii="Garamond" w:hAnsi="Garamond"/>
-          <w:sz w:val="28"/>
-          <w:szCs w:val="28"/>
         </w:rPr>
         <w:t xml:space="preserve"> class was to make you feel more confident approaching a computer</w:t>
       </w:r>
       <w:r>
         <w:rPr>
           <w:rFonts w:ascii="Garamond" w:hAnsi="Garamond"/>
-          <w:sz w:val="28"/>
-          <w:szCs w:val="28"/>
         </w:rPr>
         <w:t xml:space="preserve">. </w:t>
       </w:r>
       <w:r>
         <w:rPr>
           <w:rFonts w:ascii="Garamond" w:hAnsi="Garamond"/>
-          <w:sz w:val="28"/>
-          <w:szCs w:val="28"/>
         </w:rPr>
         <w:t>Do you feel like the class accomplished this goal? Why or why not?</w:t>
       </w:r>
@@ -547,44 +486,41 @@
       <w:pPr>
         <w:rPr>
           <w:rFonts w:ascii="Garamond" w:hAnsi="Garamond"/>
-          <w:sz w:val="28"/>
-          <w:szCs w:val="28"/>
-        </w:rPr>
-      </w:pPr>
-    </w:p>
-    <w:p>
-      <w:pPr>
-        <w:rPr>
-          <w:rFonts w:ascii="Garamond" w:hAnsi="Garamond"/>
-          <w:sz w:val="28"/>
-          <w:szCs w:val="28"/>
-        </w:rPr>
-      </w:pPr>
-    </w:p>
-    <w:p>
-      <w:pPr>
-        <w:rPr>
-          <w:rFonts w:ascii="Garamond" w:hAnsi="Garamond"/>
-          <w:sz w:val="28"/>
-          <w:szCs w:val="28"/>
-        </w:rPr>
-      </w:pPr>
-    </w:p>
-    <w:p>
-      <w:pPr>
-        <w:rPr>
-          <w:rFonts w:ascii="Garamond" w:hAnsi="Garamond"/>
-          <w:sz w:val="28"/>
-          <w:szCs w:val="28"/>
-        </w:rPr>
-      </w:pPr>
-    </w:p>
-    <w:p>
-      <w:pPr>
-        <w:rPr>
-          <w:rFonts w:ascii="Garamond" w:hAnsi="Garamond"/>
-          <w:sz w:val="28"/>
-          <w:szCs w:val="28"/>
+        </w:rPr>
+      </w:pPr>
+    </w:p>
+    <w:p>
+      <w:pPr>
+        <w:rPr>
+          <w:rFonts w:ascii="Garamond" w:hAnsi="Garamond"/>
+        </w:rPr>
+      </w:pPr>
+    </w:p>
+    <w:p>
+      <w:pPr>
+        <w:rPr>
+          <w:rFonts w:ascii="Garamond" w:hAnsi="Garamond"/>
+        </w:rPr>
+      </w:pPr>
+    </w:p>
+    <w:p>
+      <w:pPr>
+        <w:rPr>
+          <w:rFonts w:ascii="Garamond" w:hAnsi="Garamond"/>
+        </w:rPr>
+      </w:pPr>
+    </w:p>
+    <w:p>
+      <w:pPr>
+        <w:rPr>
+          <w:rFonts w:ascii="Garamond" w:hAnsi="Garamond"/>
+        </w:rPr>
+      </w:pPr>
+    </w:p>
+    <w:p>
+      <w:pPr>
+        <w:rPr>
+          <w:rFonts w:ascii="Garamond" w:hAnsi="Garamond"/>
         </w:rPr>
       </w:pPr>
     </w:p>
@@ -597,111 +533,62 @@
         </w:numPr>
         <w:rPr>
           <w:rFonts w:ascii="Garamond" w:hAnsi="Garamond"/>
-          <w:sz w:val="28"/>
-          <w:szCs w:val="28"/>
-        </w:rPr>
-      </w:pPr>
-      <w:r>
-        <w:rPr>
-          <w:rFonts w:ascii="Garamond" w:hAnsi="Garamond"/>
-          <w:sz w:val="28"/>
-          <w:szCs w:val="28"/>
+        </w:rPr>
+      </w:pPr>
+      <w:r>
+        <w:rPr>
+          <w:rFonts w:ascii="Garamond" w:hAnsi="Garamond"/>
         </w:rPr>
         <w:lastRenderedPageBreak/>
-        <w:t>Another goal of the class was</w:t>
-      </w:r>
-      <w:r>
-        <w:rPr>
-          <w:rFonts w:ascii="Garamond" w:hAnsi="Garamond"/>
-          <w:sz w:val="28"/>
-          <w:szCs w:val="28"/>
-        </w:rPr>
-        <w:t xml:space="preserve"> to show you all the layers hiding </w:t>
-      </w:r>
-      <w:r>
-        <w:rPr>
-          <w:rFonts w:ascii="Garamond" w:hAnsi="Garamond"/>
-          <w:sz w:val="28"/>
-          <w:szCs w:val="28"/>
-        </w:rPr>
-        <w:t>under</w:t>
-      </w:r>
-      <w:r>
-        <w:rPr>
-          <w:rFonts w:ascii="Garamond" w:hAnsi="Garamond"/>
-          <w:sz w:val="28"/>
-          <w:szCs w:val="28"/>
-        </w:rPr>
-        <w:t xml:space="preserve"> modern technology.</w:t>
-      </w:r>
-      <w:r>
-        <w:rPr>
-          <w:rFonts w:ascii="Garamond" w:hAnsi="Garamond"/>
-          <w:sz w:val="28"/>
-          <w:szCs w:val="28"/>
-        </w:rPr>
-        <w:t xml:space="preserve"> </w:t>
-      </w:r>
-      <w:r>
-        <w:rPr>
-          <w:rFonts w:ascii="Garamond" w:hAnsi="Garamond"/>
-          <w:sz w:val="28"/>
-          <w:szCs w:val="28"/>
-        </w:rPr>
-        <w:t>Do you feel like the class accomplished this goal? Why or why not?</w:t>
-      </w:r>
-    </w:p>
-    <w:p>
-      <w:pPr>
-        <w:rPr>
-          <w:rFonts w:ascii="Garamond" w:hAnsi="Garamond"/>
-          <w:sz w:val="28"/>
-          <w:szCs w:val="28"/>
-        </w:rPr>
-      </w:pPr>
-    </w:p>
-    <w:p>
-      <w:pPr>
-        <w:rPr>
-          <w:rFonts w:ascii="Garamond" w:hAnsi="Garamond"/>
-          <w:sz w:val="28"/>
-          <w:szCs w:val="28"/>
-        </w:rPr>
-      </w:pPr>
-    </w:p>
-    <w:p>
-      <w:pPr>
-        <w:rPr>
-          <w:rFonts w:ascii="Garamond" w:hAnsi="Garamond"/>
-          <w:sz w:val="28"/>
-          <w:szCs w:val="28"/>
-        </w:rPr>
-      </w:pPr>
-    </w:p>
-    <w:p>
-      <w:pPr>
-        <w:rPr>
-          <w:rFonts w:ascii="Garamond" w:hAnsi="Garamond"/>
-          <w:sz w:val="28"/>
-          <w:szCs w:val="28"/>
-        </w:rPr>
-      </w:pPr>
-    </w:p>
-    <w:p>
-      <w:pPr>
-        <w:rPr>
-          <w:rFonts w:ascii="Garamond" w:hAnsi="Garamond"/>
-          <w:sz w:val="28"/>
-          <w:szCs w:val="28"/>
-        </w:rPr>
-      </w:pPr>
-    </w:p>
-    <w:p>
-      <w:pPr>
-        <w:rPr>
-          <w:rFonts w:ascii="Garamond" w:hAnsi="Garamond"/>
-          <w:sz w:val="28"/>
-          <w:szCs w:val="28"/>
+        <w:t>Another goal of the class was to show you all the layers hiding under modern technology. Do you feel like the class accomplished this goal? Why or why not?</w:t>
+      </w:r>
+    </w:p>
+    <w:p>
+      <w:pPr>
+        <w:rPr>
+          <w:rFonts w:ascii="Garamond" w:hAnsi="Garamond"/>
+        </w:rPr>
+      </w:pPr>
+    </w:p>
+    <w:p>
+      <w:pPr>
+        <w:rPr>
+          <w:rFonts w:ascii="Garamond" w:hAnsi="Garamond"/>
+        </w:rPr>
+      </w:pPr>
+    </w:p>
+    <w:p>
+      <w:pPr>
+        <w:rPr>
+          <w:rFonts w:ascii="Garamond" w:hAnsi="Garamond"/>
+        </w:rPr>
+      </w:pPr>
+    </w:p>
+    <w:p>
+      <w:pPr>
+        <w:rPr>
+          <w:rFonts w:ascii="Garamond" w:hAnsi="Garamond"/>
+        </w:rPr>
+      </w:pPr>
+    </w:p>
+    <w:p>
+      <w:pPr>
+        <w:rPr>
+          <w:rFonts w:ascii="Garamond" w:hAnsi="Garamond"/>
+        </w:rPr>
+      </w:pPr>
+    </w:p>
+    <w:p>
+      <w:pPr>
+        <w:rPr>
+          <w:rFonts w:ascii="Garamond" w:hAnsi="Garamond"/>
+        </w:rPr>
+      </w:pPr>
+    </w:p>
+    <w:p>
+      <w:pPr>
+        <w:rPr>
+          <w:rFonts w:ascii="Garamond" w:hAnsi="Garamond"/>
         </w:rPr>
       </w:pPr>
     </w:p>
@@ -714,102 +601,293 @@
         </w:numPr>
         <w:rPr>
           <w:rFonts w:ascii="Garamond" w:hAnsi="Garamond"/>
-          <w:sz w:val="28"/>
-          <w:szCs w:val="28"/>
-        </w:rPr>
-      </w:pPr>
-      <w:r>
-        <w:rPr>
-          <w:rFonts w:ascii="Garamond" w:hAnsi="Garamond"/>
-          <w:sz w:val="28"/>
-          <w:szCs w:val="28"/>
-        </w:rPr>
-        <w:t>Provide one piece of constructive feedback about this class. A good piece of constructive feedback acknowledges the effort someone put into something</w:t>
-      </w:r>
-      <w:r>
-        <w:rPr>
-          <w:rFonts w:ascii="Garamond" w:hAnsi="Garamond"/>
-          <w:sz w:val="28"/>
-          <w:szCs w:val="28"/>
-        </w:rPr>
-        <w:t xml:space="preserve"> and</w:t>
-      </w:r>
-      <w:r>
-        <w:rPr>
-          <w:rFonts w:ascii="Garamond" w:hAnsi="Garamond"/>
-          <w:sz w:val="28"/>
-          <w:szCs w:val="28"/>
-        </w:rPr>
-        <w:t xml:space="preserve"> the</w:t>
-      </w:r>
-      <w:r>
-        <w:rPr>
-          <w:rFonts w:ascii="Garamond" w:hAnsi="Garamond"/>
-          <w:sz w:val="28"/>
-          <w:szCs w:val="28"/>
-        </w:rPr>
-        <w:t>n</w:t>
-      </w:r>
-      <w:r>
-        <w:rPr>
-          <w:rFonts w:ascii="Garamond" w:hAnsi="Garamond"/>
-          <w:sz w:val="28"/>
-          <w:szCs w:val="28"/>
-        </w:rPr>
-        <w:t xml:space="preserve"> provides a suggestion for how to improve.</w:t>
-      </w:r>
-    </w:p>
-    <w:p>
-      <w:pPr>
-        <w:rPr>
-          <w:rFonts w:ascii="Garamond" w:hAnsi="Garamond"/>
-          <w:sz w:val="28"/>
-          <w:szCs w:val="28"/>
-        </w:rPr>
-      </w:pPr>
-    </w:p>
-    <w:p>
-      <w:pPr>
-        <w:rPr>
-          <w:rFonts w:ascii="Garamond" w:hAnsi="Garamond"/>
-          <w:sz w:val="28"/>
-          <w:szCs w:val="28"/>
-        </w:rPr>
-      </w:pPr>
-    </w:p>
-    <w:p>
-      <w:pPr>
-        <w:rPr>
-          <w:rFonts w:ascii="Garamond" w:hAnsi="Garamond"/>
-          <w:sz w:val="28"/>
-          <w:szCs w:val="28"/>
-        </w:rPr>
-      </w:pPr>
-    </w:p>
-    <w:p>
-      <w:pPr>
-        <w:rPr>
-          <w:rFonts w:ascii="Garamond" w:hAnsi="Garamond"/>
-          <w:sz w:val="28"/>
-          <w:szCs w:val="28"/>
-        </w:rPr>
-      </w:pPr>
-    </w:p>
-    <w:p>
-      <w:pPr>
-        <w:rPr>
-          <w:rFonts w:ascii="Garamond" w:hAnsi="Garamond"/>
-          <w:sz w:val="28"/>
-          <w:szCs w:val="28"/>
-        </w:rPr>
-      </w:pPr>
-    </w:p>
-    <w:p>
-      <w:pPr>
-        <w:rPr>
-          <w:rFonts w:ascii="Garamond" w:hAnsi="Garamond"/>
-          <w:sz w:val="28"/>
-          <w:szCs w:val="28"/>
+        </w:rPr>
+      </w:pPr>
+      <w:r>
+        <w:rPr>
+          <w:rFonts w:ascii="Garamond" w:hAnsi="Garamond"/>
+        </w:rPr>
+        <w:t xml:space="preserve">Rate the following statements on a scale of 1 (strongly disagree) </w:t>
+      </w:r>
+      <w:r>
+        <w:rPr>
+          <w:rFonts w:ascii="Garamond" w:hAnsi="Garamond"/>
+        </w:rPr>
+        <w:t>-</w:t>
+      </w:r>
+      <w:r>
+        <w:rPr>
+          <w:rFonts w:ascii="Garamond" w:hAnsi="Garamond"/>
+        </w:rPr>
+        <w:t xml:space="preserve"> 10 (strongly agree):</w:t>
+      </w:r>
+    </w:p>
+    <w:p>
+      <w:pPr>
+        <w:ind w:left="360"/>
+        <w:rPr>
+          <w:rFonts w:ascii="Garamond" w:hAnsi="Garamond"/>
+        </w:rPr>
+      </w:pPr>
+    </w:p>
+    <w:p>
+      <w:pPr>
+        <w:pStyle w:val="ListParagraph"/>
+        <w:numPr>
+          <w:ilvl w:val="1"/>
+          <w:numId w:val="1"/>
+        </w:numPr>
+        <w:rPr>
+          <w:rFonts w:ascii="Garamond" w:hAnsi="Garamond"/>
+        </w:rPr>
+      </w:pPr>
+      <w:r>
+        <w:rPr>
+          <w:rFonts w:ascii="Garamond" w:hAnsi="Garamond"/>
+        </w:rPr>
+        <w:t xml:space="preserve">My teacher was prepared for class: </w:t>
+      </w:r>
+      <w:r>
+        <w:rPr>
+          <w:rFonts w:ascii="Garamond" w:hAnsi="Garamond"/>
+        </w:rPr>
+        <w:t>___</w:t>
+      </w:r>
+    </w:p>
+    <w:p>
+      <w:pPr>
+        <w:pStyle w:val="ListParagraph"/>
+        <w:rPr>
+          <w:rFonts w:ascii="Garamond" w:hAnsi="Garamond"/>
+        </w:rPr>
+      </w:pPr>
+    </w:p>
+    <w:p>
+      <w:pPr>
+        <w:pStyle w:val="ListParagraph"/>
+        <w:numPr>
+          <w:ilvl w:val="1"/>
+          <w:numId w:val="1"/>
+        </w:numPr>
+        <w:rPr>
+          <w:rFonts w:ascii="Garamond" w:hAnsi="Garamond"/>
+        </w:rPr>
+      </w:pPr>
+      <w:r>
+        <w:rPr>
+          <w:rFonts w:ascii="Garamond" w:hAnsi="Garamond"/>
+        </w:rPr>
+        <w:t xml:space="preserve">The </w:t>
+      </w:r>
+      <w:r>
+        <w:rPr>
+          <w:rFonts w:ascii="Garamond" w:hAnsi="Garamond"/>
+        </w:rPr>
+        <w:t>in-class activities</w:t>
+      </w:r>
+      <w:r>
+        <w:rPr>
+          <w:rFonts w:ascii="Garamond" w:hAnsi="Garamond"/>
+        </w:rPr>
+        <w:t xml:space="preserve"> and worksheets</w:t>
+      </w:r>
+      <w:r>
+        <w:rPr>
+          <w:rFonts w:ascii="Garamond" w:hAnsi="Garamond"/>
+        </w:rPr>
+        <w:t xml:space="preserve"> helped me understand the material: </w:t>
+      </w:r>
+      <w:r>
+        <w:rPr>
+          <w:rFonts w:ascii="Garamond" w:hAnsi="Garamond"/>
+        </w:rPr>
+        <w:t>___</w:t>
+      </w:r>
+    </w:p>
+    <w:p>
+      <w:pPr>
+        <w:rPr>
+          <w:rFonts w:ascii="Garamond" w:hAnsi="Garamond"/>
+        </w:rPr>
+      </w:pPr>
+    </w:p>
+    <w:p>
+      <w:pPr>
+        <w:pStyle w:val="ListParagraph"/>
+        <w:numPr>
+          <w:ilvl w:val="1"/>
+          <w:numId w:val="1"/>
+        </w:numPr>
+        <w:rPr>
+          <w:rFonts w:ascii="Garamond" w:hAnsi="Garamond"/>
+        </w:rPr>
+      </w:pPr>
+      <w:r>
+        <w:rPr>
+          <w:rFonts w:ascii="Garamond" w:hAnsi="Garamond"/>
+        </w:rPr>
+        <w:t xml:space="preserve">The </w:t>
+      </w:r>
+      <w:r>
+        <w:rPr>
+          <w:rFonts w:ascii="Garamond" w:hAnsi="Garamond"/>
+        </w:rPr>
+        <w:t>in-class activities</w:t>
+      </w:r>
+      <w:r>
+        <w:rPr>
+          <w:rFonts w:ascii="Garamond" w:hAnsi="Garamond"/>
+        </w:rPr>
+        <w:t xml:space="preserve"> </w:t>
+      </w:r>
+      <w:r>
+        <w:rPr>
+          <w:rFonts w:ascii="Garamond" w:hAnsi="Garamond"/>
+        </w:rPr>
+        <w:t>and worksheets</w:t>
+      </w:r>
+      <w:r>
+        <w:rPr>
+          <w:rFonts w:ascii="Garamond" w:hAnsi="Garamond"/>
+        </w:rPr>
+        <w:t xml:space="preserve"> </w:t>
+      </w:r>
+      <w:r>
+        <w:rPr>
+          <w:rFonts w:ascii="Garamond" w:hAnsi="Garamond"/>
+        </w:rPr>
+        <w:t>were</w:t>
+      </w:r>
+      <w:r>
+        <w:rPr>
+          <w:rFonts w:ascii="Garamond" w:hAnsi="Garamond"/>
+        </w:rPr>
+        <w:t xml:space="preserve"> engaging and interesting: ___</w:t>
+      </w:r>
+    </w:p>
+    <w:p>
+      <w:pPr>
+        <w:rPr>
+          <w:rFonts w:ascii="Garamond" w:hAnsi="Garamond"/>
+        </w:rPr>
+      </w:pPr>
+    </w:p>
+    <w:p>
+      <w:pPr>
+        <w:pStyle w:val="ListParagraph"/>
+        <w:numPr>
+          <w:ilvl w:val="1"/>
+          <w:numId w:val="1"/>
+        </w:numPr>
+        <w:rPr>
+          <w:rFonts w:ascii="Garamond" w:hAnsi="Garamond"/>
+        </w:rPr>
+      </w:pPr>
+      <w:r>
+        <w:rPr>
+          <w:rFonts w:ascii="Garamond" w:hAnsi="Garamond"/>
+        </w:rPr>
+        <w:t xml:space="preserve">The homework helped me understand the material: </w:t>
+      </w:r>
+      <w:r>
+        <w:rPr>
+          <w:rFonts w:ascii="Garamond" w:hAnsi="Garamond"/>
+        </w:rPr>
+        <w:t>___</w:t>
+      </w:r>
+    </w:p>
+    <w:p>
+      <w:pPr>
+        <w:rPr>
+          <w:rFonts w:ascii="Garamond" w:hAnsi="Garamond"/>
+        </w:rPr>
+      </w:pPr>
+    </w:p>
+    <w:p>
+      <w:pPr>
+        <w:pStyle w:val="ListParagraph"/>
+        <w:numPr>
+          <w:ilvl w:val="1"/>
+          <w:numId w:val="1"/>
+        </w:numPr>
+        <w:rPr>
+          <w:rFonts w:ascii="Garamond" w:hAnsi="Garamond"/>
+        </w:rPr>
+      </w:pPr>
+      <w:r>
+        <w:rPr>
+          <w:rFonts w:ascii="Garamond" w:hAnsi="Garamond"/>
+        </w:rPr>
+        <w:t>The teacher provided helpful feedback on my work: ___</w:t>
+      </w:r>
+    </w:p>
+    <w:p>
+      <w:pPr>
+        <w:rPr>
+          <w:rFonts w:ascii="Garamond" w:hAnsi="Garamond"/>
+        </w:rPr>
+      </w:pPr>
+    </w:p>
+    <w:p>
+      <w:pPr>
+        <w:pStyle w:val="ListParagraph"/>
+        <w:numPr>
+          <w:ilvl w:val="1"/>
+          <w:numId w:val="1"/>
+        </w:numPr>
+        <w:rPr>
+          <w:rFonts w:ascii="Garamond" w:hAnsi="Garamond"/>
+        </w:rPr>
+      </w:pPr>
+      <w:r>
+        <w:rPr>
+          <w:rFonts w:ascii="Garamond" w:hAnsi="Garamond"/>
+        </w:rPr>
+        <w:t xml:space="preserve">There was a good mixture of working individually and in groups: </w:t>
+      </w:r>
+      <w:r>
+        <w:rPr>
+          <w:rFonts w:ascii="Garamond" w:hAnsi="Garamond"/>
+        </w:rPr>
+        <w:t>___</w:t>
+      </w:r>
+    </w:p>
+    <w:p>
+      <w:pPr>
+        <w:rPr>
+          <w:rFonts w:ascii="Garamond" w:hAnsi="Garamond"/>
+        </w:rPr>
+      </w:pPr>
+    </w:p>
+    <w:p>
+      <w:pPr>
+        <w:pStyle w:val="ListParagraph"/>
+        <w:numPr>
+          <w:ilvl w:val="1"/>
+          <w:numId w:val="1"/>
+        </w:numPr>
+        <w:rPr>
+          <w:rFonts w:ascii="Garamond" w:hAnsi="Garamond"/>
+        </w:rPr>
+      </w:pPr>
+      <w:r>
+        <w:rPr>
+          <w:rFonts w:ascii="Garamond" w:hAnsi="Garamond"/>
+        </w:rPr>
+        <w:t>The pace of the class was appropriate (not too fast or too slow): ___</w:t>
+      </w:r>
+    </w:p>
+    <w:p>
+      <w:pPr>
+        <w:rPr>
+          <w:rFonts w:ascii="Garamond" w:hAnsi="Garamond"/>
+        </w:rPr>
+      </w:pPr>
+    </w:p>
+    <w:p>
+      <w:pPr>
+        <w:rPr>
+          <w:rFonts w:ascii="Garamond" w:hAnsi="Garamond"/>
         </w:rPr>
       </w:pPr>
     </w:p>
@@ -822,70 +900,85 @@
         </w:numPr>
         <w:rPr>
           <w:rFonts w:ascii="Garamond" w:hAnsi="Garamond"/>
-          <w:sz w:val="28"/>
-          <w:szCs w:val="28"/>
-        </w:rPr>
-      </w:pPr>
-      <w:r>
-        <w:rPr>
-          <w:rFonts w:ascii="Garamond" w:hAnsi="Garamond"/>
-          <w:sz w:val="28"/>
-          <w:szCs w:val="28"/>
-        </w:rPr>
-        <w:t>Is there anything else you think I should know about?</w:t>
-      </w:r>
-    </w:p>
-    <w:p>
-      <w:pPr>
-        <w:rPr>
-          <w:rFonts w:ascii="Garamond" w:hAnsi="Garamond"/>
-          <w:sz w:val="28"/>
-          <w:szCs w:val="28"/>
-        </w:rPr>
-      </w:pPr>
-    </w:p>
-    <w:p>
-      <w:pPr>
-        <w:rPr>
-          <w:rFonts w:ascii="Garamond" w:hAnsi="Garamond"/>
-          <w:sz w:val="28"/>
-          <w:szCs w:val="28"/>
-        </w:rPr>
-      </w:pPr>
-    </w:p>
-    <w:p>
-      <w:pPr>
-        <w:rPr>
-          <w:rFonts w:ascii="Garamond" w:hAnsi="Garamond"/>
-          <w:sz w:val="28"/>
-          <w:szCs w:val="28"/>
-        </w:rPr>
-      </w:pPr>
-    </w:p>
-    <w:p>
-      <w:pPr>
-        <w:rPr>
-          <w:rFonts w:ascii="Garamond" w:hAnsi="Garamond"/>
-          <w:sz w:val="28"/>
-          <w:szCs w:val="28"/>
-        </w:rPr>
-      </w:pPr>
-    </w:p>
-    <w:p>
-      <w:pPr>
-        <w:rPr>
-          <w:rFonts w:ascii="Garamond" w:hAnsi="Garamond"/>
-          <w:sz w:val="28"/>
-          <w:szCs w:val="28"/>
-        </w:rPr>
-      </w:pPr>
-    </w:p>
-    <w:p>
-      <w:pPr>
-        <w:rPr>
-          <w:rFonts w:ascii="Garamond" w:hAnsi="Garamond"/>
-          <w:sz w:val="28"/>
-          <w:szCs w:val="28"/>
+        </w:rPr>
+      </w:pPr>
+      <w:r>
+        <w:rPr>
+          <w:rFonts w:ascii="Garamond" w:hAnsi="Garamond"/>
+        </w:rPr>
+        <w:t>Provide one piece of constructive feedback about this class. A good piece of constructive feedback acknowledges the effort someone put into something</w:t>
+      </w:r>
+      <w:r>
+        <w:rPr>
+          <w:rFonts w:ascii="Garamond" w:hAnsi="Garamond"/>
+        </w:rPr>
+        <w:t xml:space="preserve"> and</w:t>
+      </w:r>
+      <w:r>
+        <w:rPr>
+          <w:rFonts w:ascii="Garamond" w:hAnsi="Garamond"/>
+        </w:rPr>
+        <w:t xml:space="preserve"> the</w:t>
+      </w:r>
+      <w:r>
+        <w:rPr>
+          <w:rFonts w:ascii="Garamond" w:hAnsi="Garamond"/>
+        </w:rPr>
+        <w:t>n</w:t>
+      </w:r>
+      <w:r>
+        <w:rPr>
+          <w:rFonts w:ascii="Garamond" w:hAnsi="Garamond"/>
+        </w:rPr>
+        <w:t xml:space="preserve"> provides a suggestion for how to improve.</w:t>
+      </w:r>
+    </w:p>
+    <w:p>
+      <w:pPr>
+        <w:rPr>
+          <w:rFonts w:ascii="Garamond" w:hAnsi="Garamond"/>
+        </w:rPr>
+      </w:pPr>
+    </w:p>
+    <w:p>
+      <w:pPr>
+        <w:rPr>
+          <w:rFonts w:ascii="Garamond" w:hAnsi="Garamond"/>
+        </w:rPr>
+      </w:pPr>
+    </w:p>
+    <w:p>
+      <w:pPr>
+        <w:rPr>
+          <w:rFonts w:ascii="Garamond" w:hAnsi="Garamond"/>
+        </w:rPr>
+      </w:pPr>
+    </w:p>
+    <w:p>
+      <w:pPr>
+        <w:rPr>
+          <w:rFonts w:ascii="Garamond" w:hAnsi="Garamond"/>
+        </w:rPr>
+      </w:pPr>
+    </w:p>
+    <w:p>
+      <w:pPr>
+        <w:rPr>
+          <w:rFonts w:ascii="Garamond" w:hAnsi="Garamond"/>
+        </w:rPr>
+      </w:pPr>
+    </w:p>
+    <w:p>
+      <w:pPr>
+        <w:rPr>
+          <w:rFonts w:ascii="Garamond" w:hAnsi="Garamond"/>
+        </w:rPr>
+      </w:pPr>
+    </w:p>
+    <w:p>
+      <w:pPr>
+        <w:rPr>
+          <w:rFonts w:ascii="Garamond" w:hAnsi="Garamond"/>
         </w:rPr>
       </w:pPr>
     </w:p>
@@ -898,23 +991,90 @@
         </w:numPr>
         <w:rPr>
           <w:rFonts w:ascii="Garamond" w:hAnsi="Garamond"/>
-          <w:sz w:val="28"/>
-          <w:szCs w:val="28"/>
-        </w:rPr>
-      </w:pPr>
-      <w:r>
-        <w:rPr>
-          <w:rFonts w:ascii="Garamond" w:hAnsi="Garamond"/>
-          <w:sz w:val="28"/>
-          <w:szCs w:val="28"/>
-        </w:rPr>
-        <w:t>In the space below, d</w:t>
-      </w:r>
-      <w:r>
-        <w:rPr>
-          <w:rFonts w:ascii="Garamond" w:hAnsi="Garamond"/>
-          <w:sz w:val="28"/>
-          <w:szCs w:val="28"/>
+        </w:rPr>
+      </w:pPr>
+      <w:r>
+        <w:rPr>
+          <w:rFonts w:ascii="Garamond" w:hAnsi="Garamond"/>
+        </w:rPr>
+        <w:t>Is there anything else you think I should know about?</w:t>
+      </w:r>
+    </w:p>
+    <w:p>
+      <w:pPr>
+        <w:rPr>
+          <w:rFonts w:ascii="Garamond" w:hAnsi="Garamond"/>
+        </w:rPr>
+      </w:pPr>
+    </w:p>
+    <w:p>
+      <w:pPr>
+        <w:rPr>
+          <w:rFonts w:ascii="Garamond" w:hAnsi="Garamond"/>
+        </w:rPr>
+      </w:pPr>
+    </w:p>
+    <w:p>
+      <w:pPr>
+        <w:rPr>
+          <w:rFonts w:ascii="Garamond" w:hAnsi="Garamond"/>
+        </w:rPr>
+      </w:pPr>
+    </w:p>
+    <w:p>
+      <w:pPr>
+        <w:rPr>
+          <w:rFonts w:ascii="Garamond" w:hAnsi="Garamond"/>
+        </w:rPr>
+      </w:pPr>
+    </w:p>
+    <w:p>
+      <w:pPr>
+        <w:rPr>
+          <w:rFonts w:ascii="Garamond" w:hAnsi="Garamond"/>
+        </w:rPr>
+      </w:pPr>
+    </w:p>
+    <w:p>
+      <w:pPr>
+        <w:rPr>
+          <w:rFonts w:ascii="Garamond" w:hAnsi="Garamond"/>
+        </w:rPr>
+      </w:pPr>
+    </w:p>
+    <w:p>
+      <w:pPr>
+        <w:rPr>
+          <w:rFonts w:ascii="Garamond" w:hAnsi="Garamond"/>
+        </w:rPr>
+      </w:pPr>
+    </w:p>
+    <w:p>
+      <w:pPr>
+        <w:pStyle w:val="ListParagraph"/>
+        <w:numPr>
+          <w:ilvl w:val="0"/>
+          <w:numId w:val="1"/>
+        </w:numPr>
+        <w:rPr>
+          <w:rFonts w:ascii="Garamond" w:hAnsi="Garamond"/>
+        </w:rPr>
+      </w:pPr>
+      <w:r>
+        <w:rPr>
+          <w:rFonts w:ascii="Garamond" w:hAnsi="Garamond"/>
+        </w:rPr>
+        <w:t>On a separate piece of paper</w:t>
+      </w:r>
+      <w:r>
+        <w:rPr>
+          <w:rFonts w:ascii="Garamond" w:hAnsi="Garamond"/>
+        </w:rPr>
+        <w:t>, d</w:t>
+      </w:r>
+      <w:r>
+        <w:rPr>
+          <w:rFonts w:ascii="Garamond" w:hAnsi="Garamond"/>
         </w:rPr>
         <w:t>raw your best idyllic mountain scene with mountains and trees (bonus points for including a mountain goat):</w:t>
       </w:r>
@@ -947,7 +1107,7 @@
         <w:rFonts w:hint="default"/>
       </w:rPr>
     </w:lvl>
-    <w:lvl w:ilvl="1" w:tplc="04090019" w:tentative="1">
+    <w:lvl w:ilvl="1" w:tplc="04090019">
       <w:start w:val="1"/>
       <w:numFmt w:val="lowerLetter"/>
       <w:lvlText w:val="%2."/>

</xml_diff>